<commit_message>
Package Module 8 portfolio
</commit_message>
<xml_diff>
--- a/m8/module8_portfolio.docx
+++ b/m8/module8_portfolio.docx
@@ -22,27 +22,6 @@
           <w:sz w:val="32"/>
         </w:rPr>
         <w:t>Pseudocode</w:t>
-      </w:r>
-    </w:p>
-    <w:p>
-      <w:pPr>
-        <w:spacing w:after="0"/>
-      </w:pPr>
-      <w:r>
-        <w:rPr>
-          <w:rFonts w:ascii="Courier New" w:hAnsi="Courier New"/>
-        </w:rPr>
-        <w:t>START</w:t>
-      </w:r>
-    </w:p>
-    <w:p>
-      <w:pPr>
-        <w:spacing w:after="0"/>
-      </w:pPr>
-      <w:r>
-        <w:rPr>
-          <w:rFonts w:ascii="Courier New" w:hAnsi="Courier New"/>
-        </w:rPr>
       </w:r>
     </w:p>
     <w:p>
@@ -821,27 +800,6 @@
       </w:r>
     </w:p>
     <w:p>
-      <w:pPr>
-        <w:spacing w:after="0"/>
-      </w:pPr>
-      <w:r>
-        <w:rPr>
-          <w:rFonts w:ascii="Courier New" w:hAnsi="Courier New"/>
-        </w:rPr>
-      </w:r>
-    </w:p>
-    <w:p>
-      <w:pPr>
-        <w:spacing w:after="0"/>
-      </w:pPr>
-      <w:r>
-        <w:rPr>
-          <w:rFonts w:ascii="Courier New" w:hAnsi="Courier New"/>
-        </w:rPr>
-        <w:t>END</w:t>
-      </w:r>
-    </w:p>
-    <w:p>
       <w:r>
         <w:rPr>
           <w:b/>

</xml_diff>